<commit_message>
Apply refined academic phrasing: cautious confounding statement, nuanced age interpretation, and conservative GEE wording
</commit_message>
<xml_diff>
--- a/Scopus_Statistical_Report_Final.docx
+++ b/Scopus_Statistical_Report_Final.docx
@@ -3944,7 +3944,7 @@
     </w:p>
     <w:p>
       <w:r>
-        <w:t>Clinical &amp; Behavioral Rationale for Age: Older children exhibit superior chairside behavioral cooperation, facilitating uninterrupted etching, washing, and drying. Furthermore, premolars and second molars in 11–12-year-olds have reached full clinical crown emergence, avoiding subgingival opercula and moisture pooling commonly encountered in recently erupted molars of younger children.</w:t>
+        <w:t>Clinical &amp; Behavioral Rationale for Age: This difference may be related to improved patient cooperation and greater clinical crown eruption in older children. Older pediatric patients typically demonstrate greater chairside maturity, facilitating moisture control during etching and curing, while teeth in 11–12-year-olds have generally achieved full clinical crown emergence, reducing the likelihood of subgingival opercula interfering with dry-field maintenance.</w:t>
       </w:r>
     </w:p>
     <w:p>
@@ -6500,7 +6500,7 @@
     </w:p>
     <w:p>
       <w:r>
-        <w:t>Clinical Deduction: This confirms that a patient's pre-existing baseline caries severity did not confound the technical retention of the sealant. Retention failure was governed by anatomical morphology and moisture isolation rather than individual baseline caries susceptibility.</w:t>
+        <w:t>Clinical Deduction: No statistically significant differences in baseline DMFT or DMFS were observed across retention groups, suggesting no evidence of baseline caries severity differences between groups. Technical retention failure was primarily governed by anatomical tooth morphology and moisture isolation rather than measurable differences in baseline caries indices.</w:t>
       </w:r>
     </w:p>
     <w:p>
@@ -7373,7 +7373,7 @@
           <w:i/>
           <w:sz w:val="17"/>
         </w:rPr>
-        <w:t>Note: Non-parametric Kruskal-Wallis H-test is reported as primary due to skewed distribution and small subgroup size in Score 2 (n = 5). Differences were non-significant (p &gt; 0.05), confirming absence of baseline confounding.</w:t>
+        <w:t>Note: Non-parametric Kruskal-Wallis H-test is reported as primary due to skewed distribution and small subgroup size in Score 2 (n = 5). Differences were non-significant (p &gt; 0.05), suggesting no evidence of baseline caries severity differences between retention groups.</w:t>
       </w:r>
     </w:p>
     <w:p>
@@ -7398,7 +7398,7 @@
     </w:p>
     <w:p>
       <w:r>
-        <w:t>Sensitivity Findings: The GEE modeling demonstrated that accounting for intra-subject correlation fully corroborated all primary findings:</w:t>
+        <w:t>Sensitivity Findings: The GEE modeling demonstrated that accounting for intra-subject correlation supported the direction and statistical significance of the primary findings:</w:t>
       </w:r>
     </w:p>
     <w:p>
@@ -8389,7 +8389,7 @@
         <w:t xml:space="preserve">4. Age-Dependent Compliance &amp; Crown Emergence: </w:t>
       </w:r>
       <w:r>
-        <w:t>Children older than 10 years achieved significantly higher retention than younger children (81.5% vs. 60.4%, p = 0.006; GEE cluster-adjusted p = 0.0003). This is attributed to enhanced patient cooperation and complete clinical crown emergence free of overlying gingival tissue.</w:t>
+        <w:t>Children older than 10 years achieved significantly higher retention than younger children (81.5% vs. 60.4%, p = 0.006; GEE cluster-adjusted p = 0.0003). This difference may be related to improved patient cooperation and greater clinical crown eruption free of overlying gingival tissue in older children.</w:t>
       </w:r>
     </w:p>
     <w:p>

</xml_diff>